<commit_message>
engine and other extra files
</commit_message>
<xml_diff>
--- a/Manual.docx
+++ b/Manual.docx
@@ -293,6 +293,152 @@
         </w:rPr>
         <w:t>Если есть какие-то вопросы – помечаем их комментариями</w:t>
       </w:r>
+    </w:p>
+    <w:p>
+      <w:pPr>
+        <w:pStyle w:val="a7"/>
+        <w:numPr>
+          <w:ilvl w:val="0"/>
+          <w:numId w:val="1"/>
+        </w:numPr>
+        <w:rPr>
+          <w:rFonts w:ascii="Times New Roman" w:hAnsi="Times New Roman" w:cs="Times New Roman"/>
+          <w:sz w:val="28"/>
+          <w:szCs w:val="28"/>
+        </w:rPr>
+      </w:pPr>
+      <w:proofErr w:type="spellStart"/>
+      <w:r>
+        <w:rPr>
+          <w:rFonts w:ascii="Times New Roman" w:hAnsi="Times New Roman" w:cs="Times New Roman"/>
+          <w:sz w:val="28"/>
+          <w:szCs w:val="28"/>
+        </w:rPr>
+        <w:t>Инлайн</w:t>
+      </w:r>
+      <w:proofErr w:type="spellEnd"/>
+      <w:r>
+        <w:rPr>
+          <w:rFonts w:ascii="Times New Roman" w:hAnsi="Times New Roman" w:cs="Times New Roman"/>
+          <w:sz w:val="28"/>
+          <w:szCs w:val="28"/>
+        </w:rPr>
+        <w:t xml:space="preserve">-функции пишутся в </w:t>
+      </w:r>
+      <w:proofErr w:type="spellStart"/>
+      <w:r>
+        <w:rPr>
+          <w:rFonts w:ascii="Times New Roman" w:hAnsi="Times New Roman" w:cs="Times New Roman"/>
+          <w:sz w:val="28"/>
+          <w:szCs w:val="28"/>
+        </w:rPr>
+        <w:t>хеддере</w:t>
+      </w:r>
+      <w:proofErr w:type="spellEnd"/>
+    </w:p>
+    <w:p>
+      <w:pPr>
+        <w:pStyle w:val="a7"/>
+        <w:numPr>
+          <w:ilvl w:val="0"/>
+          <w:numId w:val="1"/>
+        </w:numPr>
+        <w:rPr>
+          <w:rFonts w:ascii="Times New Roman" w:hAnsi="Times New Roman" w:cs="Times New Roman"/>
+          <w:sz w:val="28"/>
+          <w:szCs w:val="28"/>
+        </w:rPr>
+      </w:pPr>
+      <w:r>
+        <w:rPr>
+          <w:rFonts w:ascii="Times New Roman" w:hAnsi="Times New Roman" w:cs="Times New Roman"/>
+          <w:sz w:val="28"/>
+          <w:szCs w:val="28"/>
+        </w:rPr>
+        <w:t>Имена методов начинаются с маленькой, а потом каждое новое слово – с заглавной</w:t>
+      </w:r>
+    </w:p>
+    <w:p>
+      <w:pPr>
+        <w:pStyle w:val="a7"/>
+        <w:numPr>
+          <w:ilvl w:val="0"/>
+          <w:numId w:val="1"/>
+        </w:numPr>
+        <w:rPr>
+          <w:rFonts w:ascii="Times New Roman" w:hAnsi="Times New Roman" w:cs="Times New Roman"/>
+          <w:sz w:val="28"/>
+          <w:szCs w:val="28"/>
+        </w:rPr>
+      </w:pPr>
+      <w:r>
+        <w:rPr>
+          <w:rFonts w:ascii="Times New Roman" w:hAnsi="Times New Roman" w:cs="Times New Roman"/>
+          <w:sz w:val="28"/>
+          <w:szCs w:val="28"/>
+        </w:rPr>
+        <w:t>В</w:t>
+      </w:r>
+      <w:r>
+        <w:rPr>
+          <w:rFonts w:ascii="Times New Roman" w:hAnsi="Times New Roman" w:cs="Times New Roman"/>
+          <w:sz w:val="28"/>
+          <w:szCs w:val="28"/>
+        </w:rPr>
+        <w:t xml:space="preserve">езде </w:t>
+      </w:r>
+      <w:r>
+        <w:rPr>
+          <w:rFonts w:ascii="Times New Roman" w:hAnsi="Times New Roman" w:cs="Times New Roman"/>
+          <w:sz w:val="28"/>
+          <w:szCs w:val="28"/>
+        </w:rPr>
+        <w:t xml:space="preserve">сначала </w:t>
+      </w:r>
+      <w:r>
+        <w:rPr>
+          <w:rFonts w:ascii="Times New Roman" w:hAnsi="Times New Roman" w:cs="Times New Roman"/>
+          <w:b/>
+          <w:bCs/>
+          <w:sz w:val="28"/>
+          <w:szCs w:val="28"/>
+        </w:rPr>
+        <w:t>библиотеки</w:t>
+      </w:r>
+      <w:r>
+        <w:rPr>
+          <w:rFonts w:ascii="Times New Roman" w:hAnsi="Times New Roman" w:cs="Times New Roman"/>
+          <w:sz w:val="28"/>
+          <w:szCs w:val="28"/>
+        </w:rPr>
+        <w:t xml:space="preserve">, потом </w:t>
+      </w:r>
+      <w:proofErr w:type="spellStart"/>
+      <w:r>
+        <w:rPr>
+          <w:rFonts w:ascii="Times New Roman" w:hAnsi="Times New Roman" w:cs="Times New Roman"/>
+          <w:b/>
+          <w:bCs/>
+          <w:sz w:val="28"/>
+          <w:szCs w:val="28"/>
+        </w:rPr>
+        <w:t>хеддеры</w:t>
+      </w:r>
+      <w:proofErr w:type="spellEnd"/>
+    </w:p>
+    <w:p>
+      <w:pPr>
+        <w:pStyle w:val="a7"/>
+        <w:numPr>
+          <w:ilvl w:val="0"/>
+          <w:numId w:val="1"/>
+        </w:numPr>
+        <w:rPr>
+          <w:rFonts w:ascii="Times New Roman" w:hAnsi="Times New Roman" w:cs="Times New Roman"/>
+          <w:sz w:val="28"/>
+          <w:szCs w:val="28"/>
+        </w:rPr>
+      </w:pPr>
     </w:p>
     <w:sectPr>
       <w:pgSz w:w="11906" w:h="16838"/>

</xml_diff>